<commit_message>
added changes to report.docx for the datrabase instructions
</commit_message>
<xml_diff>
--- a/report and output/Report.docx
+++ b/report and output/Report.docx
@@ -28233,7 +28233,7 @@
         </w:rPr>
         <w:lastRenderedPageBreak/>
         <w:drawing>
-          <wp:inline distT="0" distB="0" distL="0" distR="0" wp14:anchorId="3036B03C" wp14:editId="517C09BD">
+          <wp:inline distT="0" distB="0" distL="0" distR="0" wp14:anchorId="3036B03C" wp14:editId="25E3B51F">
             <wp:extent cx="5943600" cy="3343275"/>
             <wp:effectExtent l="0" t="0" r="0" b="9525"/>
             <wp:docPr id="3" name="Picture 3"/>
@@ -28357,7 +28357,7 @@
           <w:lang w:val="en-US" w:eastAsia="en-US"/>
         </w:rPr>
         <w:drawing>
-          <wp:inline distT="0" distB="0" distL="0" distR="0" wp14:anchorId="381889D5" wp14:editId="0A1E8FB7">
+          <wp:inline distT="0" distB="0" distL="0" distR="0" wp14:anchorId="381889D5" wp14:editId="3273F751">
             <wp:extent cx="5943600" cy="3343275"/>
             <wp:effectExtent l="0" t="0" r="0" b="9525"/>
             <wp:docPr id="4" name="Picture 4"/>
@@ -28672,7 +28672,7 @@
         </w:rPr>
         <w:lastRenderedPageBreak/>
         <w:drawing>
-          <wp:inline distT="0" distB="0" distL="0" distR="0" wp14:anchorId="778B02C4" wp14:editId="4FA86459">
+          <wp:inline distT="0" distB="0" distL="0" distR="0" wp14:anchorId="778B02C4" wp14:editId="1455964E">
             <wp:extent cx="5943600" cy="3343275"/>
             <wp:effectExtent l="0" t="0" r="0" b="9525"/>
             <wp:docPr id="7" name="Picture 7"/>
@@ -33674,7 +33674,7 @@
         </w:rPr>
         <w:lastRenderedPageBreak/>
         <w:drawing>
-          <wp:inline distT="0" distB="0" distL="0" distR="0" wp14:anchorId="2B83C0E6" wp14:editId="21C64DEE">
+          <wp:inline distT="0" distB="0" distL="0" distR="0" wp14:anchorId="2B83C0E6" wp14:editId="27E4EC9A">
             <wp:extent cx="5826932" cy="6850380"/>
             <wp:effectExtent l="0" t="0" r="2540" b="7620"/>
             <wp:docPr id="824106045" name="Picture 1"/>
@@ -40795,8 +40795,6 @@
       <w:pPr>
         <w:spacing w:after="100"/>
         <w:rPr>
-          <w:sz w:val="21"/>
-          <w:szCs w:val="21"/>
           <w:lang w:val="en-US"/>
         </w:rPr>
       </w:pPr>
@@ -40829,6 +40827,16 @@
           <w:lang w:val="en-US"/>
         </w:rPr>
       </w:pPr>
+    </w:p>
+    <w:p>
+      <w:pPr>
+        <w:spacing w:after="100"/>
+        <w:rPr>
+          <w:sz w:val="21"/>
+          <w:szCs w:val="21"/>
+          <w:lang w:val="en-US"/>
+        </w:rPr>
+      </w:pPr>
       <w:r>
         <w:rPr>
           <w:sz w:val="21"/>
@@ -40837,6 +40845,130 @@
         </w:rPr>
         <w:t>Database script instructions</w:t>
       </w:r>
+    </w:p>
+    <w:p>
+      <w:pPr>
+        <w:spacing w:after="100"/>
+        <w:rPr>
+          <w:sz w:val="21"/>
+          <w:szCs w:val="21"/>
+          <w:lang w:val="en-US"/>
+        </w:rPr>
+      </w:pPr>
+      <w:r>
+        <w:rPr>
+          <w:sz w:val="21"/>
+          <w:szCs w:val="21"/>
+          <w:lang w:val="en-US"/>
+        </w:rPr>
+        <w:t>Demo has a database for running:</w:t>
+      </w:r>
+    </w:p>
+    <w:p>
+      <w:pPr>
+        <w:pStyle w:val="ListParagraph"/>
+        <w:numPr>
+          <w:ilvl w:val="0"/>
+          <w:numId w:val="5"/>
+        </w:numPr>
+        <w:spacing w:after="100"/>
+        <w:rPr>
+          <w:sz w:val="21"/>
+          <w:szCs w:val="21"/>
+          <w:lang w:val="en-US"/>
+        </w:rPr>
+      </w:pPr>
+      <w:r>
+        <w:rPr>
+          <w:sz w:val="21"/>
+          <w:szCs w:val="21"/>
+          <w:lang w:val="en-US"/>
+        </w:rPr>
+        <w:t>Name of database: TVMDemo</w:t>
+      </w:r>
+    </w:p>
+    <w:p>
+      <w:pPr>
+        <w:pStyle w:val="ListParagraph"/>
+        <w:numPr>
+          <w:ilvl w:val="0"/>
+          <w:numId w:val="5"/>
+        </w:numPr>
+        <w:spacing w:after="100"/>
+        <w:rPr>
+          <w:sz w:val="21"/>
+          <w:szCs w:val="21"/>
+          <w:lang w:val="en-US"/>
+        </w:rPr>
+      </w:pPr>
+      <w:r>
+        <w:rPr>
+          <w:sz w:val="21"/>
+          <w:szCs w:val="21"/>
+          <w:lang w:val="en-US"/>
+        </w:rPr>
+        <w:t>Connectionstring:</w:t>
+      </w:r>
+      <w:r>
+        <w:rPr>
+          <w:sz w:val="21"/>
+          <w:szCs w:val="21"/>
+          <w:lang w:val="en-US"/>
+        </w:rPr>
+        <w:t xml:space="preserve"> I</w:t>
+      </w:r>
+      <w:r>
+        <w:rPr>
+          <w:sz w:val="21"/>
+          <w:szCs w:val="21"/>
+          <w:lang w:val="en-US"/>
+        </w:rPr>
+        <w:t>n TVMDemo’s App.config code, under &lt;connection</w:t>
+      </w:r>
+      <w:r>
+        <w:rPr>
+          <w:sz w:val="21"/>
+          <w:szCs w:val="21"/>
+          <w:lang w:val="en-US"/>
+        </w:rPr>
+        <w:t>S</w:t>
+      </w:r>
+      <w:r>
+        <w:rPr>
+          <w:sz w:val="21"/>
+          <w:szCs w:val="21"/>
+          <w:lang w:val="en-US"/>
+        </w:rPr>
+        <w:t>tring&gt; code block</w:t>
+      </w:r>
+    </w:p>
+    <w:p>
+      <w:pPr>
+        <w:spacing w:after="100"/>
+        <w:rPr>
+          <w:sz w:val="21"/>
+          <w:szCs w:val="21"/>
+          <w:lang w:val="en-US"/>
+        </w:rPr>
+      </w:pPr>
+      <w:r>
+        <w:rPr>
+          <w:sz w:val="21"/>
+          <w:szCs w:val="21"/>
+          <w:lang w:val="en-US"/>
+        </w:rPr>
+        <w:t>Download TVM, TVMDemo and database.sql. Run the database.sql in SSMS, then open the TVM, TVMDemo in Visual Studio, go to TVMDemo’s App.config and change connectionString to your SSMS SQL Server instance then confirm connection. After that, press F5.</w:t>
+      </w:r>
+    </w:p>
+    <w:p>
+      <w:pPr>
+        <w:spacing w:after="100"/>
+        <w:rPr>
+          <w:sz w:val="21"/>
+          <w:szCs w:val="21"/>
+          <w:lang w:val="en-US"/>
+        </w:rPr>
+      </w:pPr>
     </w:p>
     <w:p>
       <w:pPr>
@@ -41423,6 +41555,7 @@
         </w:rPr>
       </w:pPr>
       <w:r>
+        <w:lastRenderedPageBreak/>
         <w:t>Use case diagram</w:t>
       </w:r>
       <w:r>
@@ -42159,7 +42292,7 @@
           <w:lang w:val="en-US"/>
         </w:rPr>
         <w:drawing>
-          <wp:inline distT="0" distB="0" distL="0" distR="0" wp14:anchorId="6F3C1547" wp14:editId="413823E8">
+          <wp:inline distT="0" distB="0" distL="0" distR="0" wp14:anchorId="6F3C1547" wp14:editId="4BA22EA9">
             <wp:extent cx="5827090" cy="6850566"/>
             <wp:effectExtent l="0" t="0" r="2540" b="7620"/>
             <wp:docPr id="1411043869" name="Picture 1"/>
@@ -43391,6 +43524,232 @@
     </w:lvl>
   </w:abstractNum>
   <w:abstractNum w:abstractNumId="15" w15:restartNumberingAfterBreak="0">
+    <w:nsid w:val="6DF0669C"/>
+    <w:multiLevelType w:val="hybridMultilevel"/>
+    <w:tmpl w:val="809A0D90"/>
+    <w:lvl w:ilvl="0" w:tplc="04090001">
+      <w:start w:val="1"/>
+      <w:numFmt w:val="bullet"/>
+      <w:lvlText w:val=""/>
+      <w:lvlJc w:val="left"/>
+      <w:pPr>
+        <w:ind w:left="720" w:hanging="360"/>
+      </w:pPr>
+      <w:rPr>
+        <w:rFonts w:ascii="Symbol" w:hAnsi="Symbol" w:hint="default"/>
+      </w:rPr>
+    </w:lvl>
+    <w:lvl w:ilvl="1" w:tplc="04090003" w:tentative="1">
+      <w:start w:val="1"/>
+      <w:numFmt w:val="bullet"/>
+      <w:lvlText w:val="o"/>
+      <w:lvlJc w:val="left"/>
+      <w:pPr>
+        <w:ind w:left="1440" w:hanging="360"/>
+      </w:pPr>
+      <w:rPr>
+        <w:rFonts w:ascii="Courier New" w:hAnsi="Courier New" w:cs="Courier New" w:hint="default"/>
+      </w:rPr>
+    </w:lvl>
+    <w:lvl w:ilvl="2" w:tplc="04090005" w:tentative="1">
+      <w:start w:val="1"/>
+      <w:numFmt w:val="bullet"/>
+      <w:lvlText w:val=""/>
+      <w:lvlJc w:val="left"/>
+      <w:pPr>
+        <w:ind w:left="2160" w:hanging="360"/>
+      </w:pPr>
+      <w:rPr>
+        <w:rFonts w:ascii="Wingdings" w:hAnsi="Wingdings" w:hint="default"/>
+      </w:rPr>
+    </w:lvl>
+    <w:lvl w:ilvl="3" w:tplc="04090001" w:tentative="1">
+      <w:start w:val="1"/>
+      <w:numFmt w:val="bullet"/>
+      <w:lvlText w:val=""/>
+      <w:lvlJc w:val="left"/>
+      <w:pPr>
+        <w:ind w:left="2880" w:hanging="360"/>
+      </w:pPr>
+      <w:rPr>
+        <w:rFonts w:ascii="Symbol" w:hAnsi="Symbol" w:hint="default"/>
+      </w:rPr>
+    </w:lvl>
+    <w:lvl w:ilvl="4" w:tplc="04090003" w:tentative="1">
+      <w:start w:val="1"/>
+      <w:numFmt w:val="bullet"/>
+      <w:lvlText w:val="o"/>
+      <w:lvlJc w:val="left"/>
+      <w:pPr>
+        <w:ind w:left="3600" w:hanging="360"/>
+      </w:pPr>
+      <w:rPr>
+        <w:rFonts w:ascii="Courier New" w:hAnsi="Courier New" w:cs="Courier New" w:hint="default"/>
+      </w:rPr>
+    </w:lvl>
+    <w:lvl w:ilvl="5" w:tplc="04090005" w:tentative="1">
+      <w:start w:val="1"/>
+      <w:numFmt w:val="bullet"/>
+      <w:lvlText w:val=""/>
+      <w:lvlJc w:val="left"/>
+      <w:pPr>
+        <w:ind w:left="4320" w:hanging="360"/>
+      </w:pPr>
+      <w:rPr>
+        <w:rFonts w:ascii="Wingdings" w:hAnsi="Wingdings" w:hint="default"/>
+      </w:rPr>
+    </w:lvl>
+    <w:lvl w:ilvl="6" w:tplc="04090001" w:tentative="1">
+      <w:start w:val="1"/>
+      <w:numFmt w:val="bullet"/>
+      <w:lvlText w:val=""/>
+      <w:lvlJc w:val="left"/>
+      <w:pPr>
+        <w:ind w:left="5040" w:hanging="360"/>
+      </w:pPr>
+      <w:rPr>
+        <w:rFonts w:ascii="Symbol" w:hAnsi="Symbol" w:hint="default"/>
+      </w:rPr>
+    </w:lvl>
+    <w:lvl w:ilvl="7" w:tplc="04090003" w:tentative="1">
+      <w:start w:val="1"/>
+      <w:numFmt w:val="bullet"/>
+      <w:lvlText w:val="o"/>
+      <w:lvlJc w:val="left"/>
+      <w:pPr>
+        <w:ind w:left="5760" w:hanging="360"/>
+      </w:pPr>
+      <w:rPr>
+        <w:rFonts w:ascii="Courier New" w:hAnsi="Courier New" w:cs="Courier New" w:hint="default"/>
+      </w:rPr>
+    </w:lvl>
+    <w:lvl w:ilvl="8" w:tplc="04090005" w:tentative="1">
+      <w:start w:val="1"/>
+      <w:numFmt w:val="bullet"/>
+      <w:lvlText w:val=""/>
+      <w:lvlJc w:val="left"/>
+      <w:pPr>
+        <w:ind w:left="6480" w:hanging="360"/>
+      </w:pPr>
+      <w:rPr>
+        <w:rFonts w:ascii="Wingdings" w:hAnsi="Wingdings" w:hint="default"/>
+      </w:rPr>
+    </w:lvl>
+  </w:abstractNum>
+  <w:abstractNum w:abstractNumId="16" w15:restartNumberingAfterBreak="0">
+    <w:nsid w:val="76766B72"/>
+    <w:multiLevelType w:val="multilevel"/>
+    <w:tmpl w:val="8960CC40"/>
+    <w:lvl w:ilvl="0">
+      <w:start w:val="1"/>
+      <w:numFmt w:val="decimal"/>
+      <w:lvlText w:val="%1."/>
+      <w:lvlJc w:val="left"/>
+      <w:pPr>
+        <w:tabs>
+          <w:tab w:val="num" w:pos="720"/>
+        </w:tabs>
+        <w:ind w:left="720" w:hanging="360"/>
+      </w:pPr>
+    </w:lvl>
+    <w:lvl w:ilvl="1" w:tentative="1">
+      <w:start w:val="1"/>
+      <w:numFmt w:val="decimal"/>
+      <w:lvlText w:val="%2."/>
+      <w:lvlJc w:val="left"/>
+      <w:pPr>
+        <w:tabs>
+          <w:tab w:val="num" w:pos="1440"/>
+        </w:tabs>
+        <w:ind w:left="1440" w:hanging="360"/>
+      </w:pPr>
+    </w:lvl>
+    <w:lvl w:ilvl="2" w:tentative="1">
+      <w:start w:val="1"/>
+      <w:numFmt w:val="decimal"/>
+      <w:lvlText w:val="%3."/>
+      <w:lvlJc w:val="left"/>
+      <w:pPr>
+        <w:tabs>
+          <w:tab w:val="num" w:pos="2160"/>
+        </w:tabs>
+        <w:ind w:left="2160" w:hanging="360"/>
+      </w:pPr>
+    </w:lvl>
+    <w:lvl w:ilvl="3" w:tentative="1">
+      <w:start w:val="1"/>
+      <w:numFmt w:val="decimal"/>
+      <w:lvlText w:val="%4."/>
+      <w:lvlJc w:val="left"/>
+      <w:pPr>
+        <w:tabs>
+          <w:tab w:val="num" w:pos="2880"/>
+        </w:tabs>
+        <w:ind w:left="2880" w:hanging="360"/>
+      </w:pPr>
+    </w:lvl>
+    <w:lvl w:ilvl="4" w:tentative="1">
+      <w:start w:val="1"/>
+      <w:numFmt w:val="decimal"/>
+      <w:lvlText w:val="%5."/>
+      <w:lvlJc w:val="left"/>
+      <w:pPr>
+        <w:tabs>
+          <w:tab w:val="num" w:pos="3600"/>
+        </w:tabs>
+        <w:ind w:left="3600" w:hanging="360"/>
+      </w:pPr>
+    </w:lvl>
+    <w:lvl w:ilvl="5" w:tentative="1">
+      <w:start w:val="1"/>
+      <w:numFmt w:val="decimal"/>
+      <w:lvlText w:val="%6."/>
+      <w:lvlJc w:val="left"/>
+      <w:pPr>
+        <w:tabs>
+          <w:tab w:val="num" w:pos="4320"/>
+        </w:tabs>
+        <w:ind w:left="4320" w:hanging="360"/>
+      </w:pPr>
+    </w:lvl>
+    <w:lvl w:ilvl="6" w:tentative="1">
+      <w:start w:val="1"/>
+      <w:numFmt w:val="decimal"/>
+      <w:lvlText w:val="%7."/>
+      <w:lvlJc w:val="left"/>
+      <w:pPr>
+        <w:tabs>
+          <w:tab w:val="num" w:pos="5040"/>
+        </w:tabs>
+        <w:ind w:left="5040" w:hanging="360"/>
+      </w:pPr>
+    </w:lvl>
+    <w:lvl w:ilvl="7" w:tentative="1">
+      <w:start w:val="1"/>
+      <w:numFmt w:val="decimal"/>
+      <w:lvlText w:val="%8."/>
+      <w:lvlJc w:val="left"/>
+      <w:pPr>
+        <w:tabs>
+          <w:tab w:val="num" w:pos="5760"/>
+        </w:tabs>
+        <w:ind w:left="5760" w:hanging="360"/>
+      </w:pPr>
+    </w:lvl>
+    <w:lvl w:ilvl="8" w:tentative="1">
+      <w:start w:val="1"/>
+      <w:numFmt w:val="decimal"/>
+      <w:lvlText w:val="%9."/>
+      <w:lvlJc w:val="left"/>
+      <w:pPr>
+        <w:tabs>
+          <w:tab w:val="num" w:pos="6480"/>
+        </w:tabs>
+        <w:ind w:left="6480" w:hanging="360"/>
+      </w:pPr>
+    </w:lvl>
+  </w:abstractNum>
+  <w:abstractNum w:abstractNumId="17" w15:restartNumberingAfterBreak="0">
     <w:nsid w:val="7B276D14"/>
     <w:multiLevelType w:val="multilevel"/>
     <w:tmpl w:val="F1B0A08C"/>
@@ -43552,10 +43911,16 @@
     </w:lvlOverride>
   </w:num>
   <w:num w:numId="3" w16cid:durableId="1193416232">
-    <w:abstractNumId w:val="15"/>
+    <w:abstractNumId w:val="17"/>
   </w:num>
   <w:num w:numId="4" w16cid:durableId="895553690">
     <w:abstractNumId w:val="3"/>
+  </w:num>
+  <w:num w:numId="5" w16cid:durableId="1794596445">
+    <w:abstractNumId w:val="15"/>
+  </w:num>
+  <w:num w:numId="6" w16cid:durableId="740718238">
+    <w:abstractNumId w:val="16"/>
   </w:num>
 </w:numbering>
 </file>

</xml_diff>